<commit_message>
Add live Android phone execution screenshots to report and screenshots folder
</commit_message>
<xml_diff>
--- a/Experiment5_Vuforia_Cylinder_Tracking.docx
+++ b/Experiment5_Vuforia_Cylinder_Tracking.docx
@@ -159,7 +159,6 @@
         <w:t>Objectives</w:t>
       </w:r>
     </w:p>
-    <w:p/>
     <w:p>
       <w:pPr>
         <w:pStyle w:val="ListBullet"/>
@@ -213,6 +212,17 @@
           <w:sz w:val="21"/>
         </w:rPr>
         <w:t>To develop interactive C# scripts to trigger dynamic Augmented Image overlays and hardware-accelerated Augmented Video playback upon optical target acquisition.</w:t>
+      </w:r>
+    </w:p>
+    <w:p>
+      <w:pPr>
+        <w:pStyle w:val="ListBullet"/>
+      </w:pPr>
+      <w:r>
+        <w:rPr>
+          <w:sz w:val="21"/>
+        </w:rPr>
+        <w:t>To deploy, test, and validate the application directly onto a physical Android device (vivo 1919) via USB debugging.</w:t>
       </w:r>
     </w:p>
     <w:p>
@@ -409,6 +419,34 @@
                 <w:sz w:val="19"/>
               </w:rPr>
               <w:t>Event handling (`ObserverBehaviour`), video playback lifecycle, and on-screen AR HUD.</w:t>
+            </w:r>
+          </w:p>
+        </w:tc>
+      </w:tr>
+      <w:tr>
+        <w:tc>
+          <w:tcPr>
+            <w:tcW w:type="dxa" w:w="4680"/>
+          </w:tcPr>
+          <w:p>
+            <w:r>
+              <w:rPr>
+                <w:sz w:val="19"/>
+              </w:rPr>
+              <w:t>Android Device (vivo 1919) &amp; ADB</w:t>
+            </w:r>
+          </w:p>
+        </w:tc>
+        <w:tc>
+          <w:tcPr>
+            <w:tcW w:type="dxa" w:w="4680"/>
+          </w:tcPr>
+          <w:p>
+            <w:r>
+              <w:rPr>
+                <w:sz w:val="19"/>
+              </w:rPr>
+              <w:t>Physical hardware target, camera stream capture, and live USB debugging deployment.</w:t>
             </w:r>
           </w:p>
         </w:tc>
@@ -838,7 +876,7 @@
           <w:color w:val="0284C7"/>
           <w:sz w:val="26"/>
         </w:rPr>
-        <w:t>Step 5: Execution and Testing</w:t>
+        <w:t>Step 5: Mobile Android Deployment via USB Debugging</w:t>
       </w:r>
     </w:p>
     <w:p>
@@ -846,13 +884,13 @@
         <w:rPr>
           <w:sz w:val="20"/>
         </w:rPr>
-        <w:t>1. Press the Play button in Unity Editor.</w:t>
+        <w:t>1. Connect the physical Android phone (vivo 1919) via USB and enable USB Debugging in Developer Options.</w:t>
         <w:br/>
-        <w:t>2. Present the printable cylinder marker (CYLINDER_MARKER_TO_SCAN.png) or wrap it around a real beverage can/bottle in front of the camera.</w:t>
+        <w:t>2. Compile the package and deploy the APK directly over ADB using `adb install -r Vuforia_CylinderTracking.apk`.</w:t>
         <w:br/>
-        <w:t>3. Verify that the augmented video starts playing seamlessly on the front face of the cylinder and the holographic telemetry card locks rigidly to the cylinder.</w:t>
+        <w:t>3. Launch the application with `adb shell am start -n com.varad.vuforiacylinder/.MainActivity`.</w:t>
         <w:br/>
-        <w:t>4. Use the on-screen UI buttons or press 'T' to test simulation toggle, play/pause video, and restart video.</w:t>
+        <w:t>4. Present the cylinder marker in front of the camera and verify real-time 3D optical tracking, video playback, and holographic overlay.</w:t>
       </w:r>
     </w:p>
     <w:p>
@@ -907,8 +945,6 @@
         <w:br/>
         <w:br/>
         <w:t xml:space="preserve">    public static bool IsCylinderTracked { get; private set; } = false;</w:t>
-        <w:br/>
-        <w:t xml:space="preserve">    public static string TrackingStatusMessage { get; private set; } = "Initializing...";</w:t>
         <w:br/>
         <w:br/>
         <w:t xml:space="preserve">    private void Start()</w:t>
@@ -1068,7 +1104,7 @@
     </w:p>
     <w:p>
       <w:r>
-        <w:t>The application was tested in Unity 6 Play Mode and validated on standard webcam/mobile camera feeds. When the physical cylinder marker enters the camera frustum, Vuforia detects the FAST corner features, locks the 6-DOF pose within &lt;16 ms, and rigidly anchors the Augmented Video and Augmented Image Card. Below are the verified technical screenshots and architectural diagrams:</w:t>
+        <w:t>The application was tested in Unity 6 Play Mode and deployed directly to a physical Android device (vivo 1919) via USB debugging. When the cylinder marker enters the camera frustum, the computer vision engine locks the 6-DOF optical pose and renders the Augmented Video and Augmented Image Card. Below are the verified technical screenshots and live mobile captures:</w:t>
       </w:r>
     </w:p>
     <w:p>
@@ -1301,6 +1337,120 @@
     </w:p>
     <w:p>
       <w:pPr>
+        <w:spacing w:before="160" w:after="40"/>
+        <w:jc w:val="center"/>
+      </w:pPr>
+    </w:p>
+    <w:p>
+      <w:r>
+        <w:drawing>
+          <wp:inline xmlns:a="http://schemas.openxmlformats.org/drawingml/2006/main" xmlns:pic="http://schemas.openxmlformats.org/drawingml/2006/picture">
+            <wp:extent cx="2743200" cy="6096000"/>
+            <wp:docPr id="5" name="Picture 5"/>
+            <wp:cNvGraphicFramePr>
+              <a:graphicFrameLocks noChangeAspect="1"/>
+            </wp:cNvGraphicFramePr>
+            <a:graphic>
+              <a:graphicData uri="http://schemas.openxmlformats.org/drawingml/2006/picture">
+                <pic:pic>
+                  <pic:nvPicPr>
+                    <pic:cNvPr id="0" name="phone_screenshot_live.png"/>
+                    <pic:cNvPicPr/>
+                  </pic:nvPicPr>
+                  <pic:blipFill>
+                    <a:blip r:embed="rId13"/>
+                    <a:stretch>
+                      <a:fillRect/>
+                    </a:stretch>
+                  </pic:blipFill>
+                  <pic:spPr>
+                    <a:xfrm>
+                      <a:off x="0" y="0"/>
+                      <a:ext cx="2743200" cy="6096000"/>
+                    </a:xfrm>
+                    <a:prstGeom prst="rect"/>
+                  </pic:spPr>
+                </pic:pic>
+              </a:graphicData>
+            </a:graphic>
+          </wp:inline>
+        </w:drawing>
+      </w:r>
+    </w:p>
+    <w:p>
+      <w:pPr>
+        <w:spacing w:after="240"/>
+        <w:jc w:val="center"/>
+      </w:pPr>
+      <w:r>
+        <w:rPr>
+          <w:b/>
+          <w:i/>
+          <w:color w:val="475569"/>
+          <w:sz w:val="19"/>
+        </w:rPr>
+        <w:t>Figure 5: Live Android USB Debugging Execution - Camera Viewfinder &amp; Alignment Reticle (vivo 1919)</w:t>
+      </w:r>
+    </w:p>
+    <w:p>
+      <w:pPr>
+        <w:spacing w:before="160" w:after="40"/>
+        <w:jc w:val="center"/>
+      </w:pPr>
+    </w:p>
+    <w:p>
+      <w:r>
+        <w:drawing>
+          <wp:inline xmlns:a="http://schemas.openxmlformats.org/drawingml/2006/main" xmlns:pic="http://schemas.openxmlformats.org/drawingml/2006/picture">
+            <wp:extent cx="2743200" cy="6096000"/>
+            <wp:docPr id="6" name="Picture 6"/>
+            <wp:cNvGraphicFramePr>
+              <a:graphicFrameLocks noChangeAspect="1"/>
+            </wp:cNvGraphicFramePr>
+            <a:graphic>
+              <a:graphicData uri="http://schemas.openxmlformats.org/drawingml/2006/picture">
+                <pic:pic>
+                  <pic:nvPicPr>
+                    <pic:cNvPr id="0" name="phone_screenshot_locked.png"/>
+                    <pic:cNvPicPr/>
+                  </pic:nvPicPr>
+                  <pic:blipFill>
+                    <a:blip r:embed="rId14"/>
+                    <a:stretch>
+                      <a:fillRect/>
+                    </a:stretch>
+                  </pic:blipFill>
+                  <pic:spPr>
+                    <a:xfrm>
+                      <a:off x="0" y="0"/>
+                      <a:ext cx="2743200" cy="6096000"/>
+                    </a:xfrm>
+                    <a:prstGeom prst="rect"/>
+                  </pic:spPr>
+                </pic:pic>
+              </a:graphicData>
+            </a:graphic>
+          </wp:inline>
+        </w:drawing>
+      </w:r>
+    </w:p>
+    <w:p>
+      <w:pPr>
+        <w:spacing w:after="240"/>
+        <w:jc w:val="center"/>
+      </w:pPr>
+      <w:r>
+        <w:rPr>
+          <w:b/>
+          <w:i/>
+          <w:color w:val="475569"/>
+          <w:sz w:val="19"/>
+        </w:rPr>
+        <w:t>Figure 6: Live Android USB Debugging Execution - Target Locked with 3D Cylinder, Augmented Video &amp; Holographic Card (vivo 1919)</w:t>
+      </w:r>
+    </w:p>
+    <w:p>
+      <w:pPr>
         <w:pStyle w:val="Heading1"/>
         <w:spacing w:before="280" w:after="120"/>
       </w:pPr>
@@ -1316,7 +1466,7 @@
     </w:p>
     <w:p>
       <w:r>
-        <w:t>In this experiment, marker-based optical tracking of a 3D cylinder object was successfully implemented in Unity 6 using Vuforia Engine SDK (11.4.4). A custom 360-degree unrolled cylinder label was engineered adhering to the exact mathematical circumference-to-height ratio (1.70), achieving an optimal 5-star rating in the Vuforia Target Manager. The Unity project was structured with an ARCamera, CylinderTarget observer, hardware-accelerated VideoPlayer, and holographic telemetry HUD. Real-time testing confirmed robust 6-DOF tracking, seamless video playback synchronization, and zero rotational ambiguity across full 360-degree object rotations.</w:t>
+        <w:t>In this experiment, marker-based optical tracking of a 3D cylinder object was successfully implemented in Unity 6 using Vuforia Engine SDK (11.4.4). A custom 360-degree unrolled cylinder label was engineered adhering to the exact mathematical circumference-to-height ratio (1.70), achieving an optimal 5-star rating in the Vuforia Target Manager. The Unity project was structured with an ARCamera, CylinderTarget observer, hardware-accelerated VideoPlayer, and holographic telemetry HUD. Furthermore, the application was compiled into a standalone Android package and deployed directly onto a physical Android device (vivo 1919) via USB debugging. Real-time testing confirmed robust 6-DOF tracking, seamless video playback synchronization, and zero rotational ambiguity across full 360-degree object rotations.</w:t>
       </w:r>
     </w:p>
     <w:sectPr>

</xml_diff>